<commit_message>
fix(proyectos): StockPro fuera de ELBRUX y numero legible sobre la captura
La vinieta de StockPro sale de la experiencia de ELBRUX, en el portfolio y en
el CV: la entrega fue aparte de la marca, asi que el proyecto se cuenta solo
en Proyectos, que es donde corresponde.

El numero de la pieza pasa a un circulo con fondo. Arriba el velo llega a
to-gray-950/15, practicamente transparente, y el numero quedaba sobre la
captura sin nada detras. Lleva el mismo tratamiento por tema que el distintivo
de ELBRUX, que ocupa la esquina opuesta.

El CV vive fuera del repositorio (cv/ esta en .gitignore, lleva el telefono),
pero sus dos .docx publicos si viajan aqui y se regeneran: ahora tienen una
seccion de Proyectos con los nueve del portfolio, detras de Habilidades para
no empujar hacia abajo lo que mas puntua un ATS, y fuera de Habilidades
Tecnicas quedan Oracle SQL, GeneXus y WordPress.

Co-Authored-By: Claude Opus 5 <noreply@anthropic.com>
</commit_message>
<xml_diff>
--- a/public/cv/Pablo-Ocampos-CV-EN.docx
+++ b/public/cv/Pablo-Ocampos-CV-EN.docx
@@ -368,25 +368,6 @@
     </w:p>
     <w:p>
       <w:pPr>
-        <w:pStyle w:val="ListParagraph"/>
-        <w:numPr>
-          <w:ilvl w:val="0"/>
-          <w:numId w:val="1"/>
-        </w:numPr>
-        <w:spacing w:after="55"/>
-        <w:ind w:left="360"/>
-      </w:pPr>
-      <w:r>
-        <w:rPr>
-          <w:rFonts w:ascii="Calibri" w:cs="Calibri" w:eastAsia="Calibri" w:hAnsi="Calibri"/>
-          <w:sz w:val="19"/>
-          <w:szCs w:val="19"/>
-        </w:rPr>
-        <w:t xml:space="preserve">Delivered StockPro, a Python and SQLite desktop application for commercial management installed at a client site, with point of sale, stock ledger, customer accounts, cash reconciliation, profitability reports, remote updates and versioned schema migrations.</w:t>
-      </w:r>
-    </w:p>
-    <w:p>
-      <w:pPr>
         <w:spacing w:after="20" w:before="130"/>
       </w:pPr>
       <w:r>
@@ -763,7 +744,7 @@
           <w:sz w:val="19"/>
           <w:szCs w:val="19"/>
         </w:rPr>
-        <w:t xml:space="preserve">Java, Spring Boot, PHP, MySQL, Angular, Bootstrap, TypeScript, JavaScript, HTML5, CSS3, SQLite, Firebase, Oracle SQL, GeneXus, WordPress</w:t>
+        <w:t xml:space="preserve">Java, Spring Boot, PHP, MySQL, Angular, Bootstrap, TypeScript, JavaScript, HTML5, CSS3, SQLite, Firebase</w:t>
       </w:r>
     </w:p>
     <w:p>
@@ -925,6 +906,196 @@
           <w:szCs w:val="19"/>
         </w:rPr>
         <w:t xml:space="preserve">Claude, ChatGPT, Gemini, DeepSeek</w:t>
+      </w:r>
+    </w:p>
+    <w:p>
+      <w:pPr>
+        <w:pBdr>
+          <w:bottom w:val="single" w:color="999999" w:sz="6" w:space="2"/>
+        </w:pBdr>
+        <w:spacing w:after="110" w:before="240"/>
+      </w:pPr>
+      <w:r>
+        <w:rPr>
+          <w:rFonts w:ascii="Calibri" w:cs="Calibri" w:eastAsia="Calibri" w:hAnsi="Calibri"/>
+          <w:b/>
+          <w:bCs/>
+          <w:color w:val="1F3864"/>
+          <w:sz w:val="23"/>
+          <w:szCs w:val="23"/>
+        </w:rPr>
+        <w:t xml:space="preserve">PROJECTS</w:t>
+      </w:r>
+    </w:p>
+    <w:p>
+      <w:pPr>
+        <w:pStyle w:val="ListParagraph"/>
+        <w:numPr>
+          <w:ilvl w:val="0"/>
+          <w:numId w:val="1"/>
+        </w:numPr>
+        <w:spacing w:after="55"/>
+        <w:ind w:left="360"/>
+      </w:pPr>
+      <w:r>
+        <w:rPr>
+          <w:rFonts w:ascii="Calibri" w:cs="Calibri" w:eastAsia="Calibri" w:hAnsi="Calibri"/>
+          <w:sz w:val="19"/>
+          <w:szCs w:val="19"/>
+        </w:rPr>
+        <w:t xml:space="preserve">Faro - Multi-tenant HR web platform, running in production for an industrial company of 80 employees: payroll runs, attendance tracking through a face-recognition kiosk and signed PDF payslips with a public QR validation code. Python, FastAPI, PostgreSQL, React, Tailwind CSS, Docker.</w:t>
+      </w:r>
+    </w:p>
+    <w:p>
+      <w:pPr>
+        <w:pStyle w:val="ListParagraph"/>
+        <w:numPr>
+          <w:ilvl w:val="0"/>
+          <w:numId w:val="1"/>
+        </w:numPr>
+        <w:spacing w:after="55"/>
+        <w:ind w:left="360"/>
+      </w:pPr>
+      <w:r>
+        <w:rPr>
+          <w:rFonts w:ascii="Calibri" w:cs="Calibri" w:eastAsia="Calibri" w:hAnsi="Calibri"/>
+          <w:sz w:val="19"/>
+          <w:szCs w:val="19"/>
+        </w:rPr>
+        <w:t xml:space="preserve">Timon - Management system for car repair shops: work orders with an eight-stage pipeline, spare-part inventory with automatic stock deduction, daily cash register and public QR tracking. Built on Faro's multi-tenant core. Python, FastAPI, PostgreSQL, React, Tailwind CSS, Docker.</w:t>
+      </w:r>
+    </w:p>
+    <w:p>
+      <w:pPr>
+        <w:pStyle w:val="ListParagraph"/>
+        <w:numPr>
+          <w:ilvl w:val="0"/>
+          <w:numId w:val="1"/>
+        </w:numPr>
+        <w:spacing w:after="55"/>
+        <w:ind w:left="360"/>
+      </w:pPr>
+      <w:r>
+        <w:rPr>
+          <w:rFonts w:ascii="Calibri" w:cs="Calibri" w:eastAsia="Calibri" w:hAnsi="Calibri"/>
+          <w:sz w:val="19"/>
+          <w:szCs w:val="19"/>
+        </w:rPr>
+        <w:t xml:space="preserve">StockPro - Desktop application for commercial management, installed and in daily use at a client: point of sale, stock ledger, customer accounts, cash reconciliation and profitability reports, running fully offline. Python, Tkinter, SQLite.</w:t>
+      </w:r>
+    </w:p>
+    <w:p>
+      <w:pPr>
+        <w:pStyle w:val="ListParagraph"/>
+        <w:numPr>
+          <w:ilvl w:val="0"/>
+          <w:numId w:val="1"/>
+        </w:numPr>
+        <w:spacing w:after="55"/>
+        <w:ind w:left="360"/>
+      </w:pPr>
+      <w:r>
+        <w:rPr>
+          <w:rFonts w:ascii="Calibri" w:cs="Calibri" w:eastAsia="Calibri" w:hAnsi="Calibri"/>
+          <w:sz w:val="19"/>
+          <w:szCs w:val="19"/>
+        </w:rPr>
+        <w:t xml:space="preserve">BioTech - Modular ERP for an agro-industrial company: planning, overtime, credit requests and analytics dashboards, pulling data from external systems. Java, Spring Boot, PostgreSQL, React, Bootstrap, Docker.</w:t>
+      </w:r>
+    </w:p>
+    <w:p>
+      <w:pPr>
+        <w:pStyle w:val="ListParagraph"/>
+        <w:numPr>
+          <w:ilvl w:val="0"/>
+          <w:numId w:val="1"/>
+        </w:numPr>
+        <w:spacing w:after="55"/>
+        <w:ind w:left="360"/>
+      </w:pPr>
+      <w:r>
+        <w:rPr>
+          <w:rFonts w:ascii="Calibri" w:cs="Calibri" w:eastAsia="Calibri" w:hAnsi="Calibri"/>
+          <w:sz w:val="19"/>
+          <w:szCs w:val="19"/>
+        </w:rPr>
+        <w:t xml:space="preserve">Cinemateca - Film catalogue holding TMDb's full census (over 1.2 million titles), same-day releases and a screening room for public-domain works, with resumable importers and the licensing rules enforced in the database. Python, FastAPI, PostgreSQL, React, Tailwind CSS, Docker.</w:t>
+      </w:r>
+    </w:p>
+    <w:p>
+      <w:pPr>
+        <w:pStyle w:val="ListParagraph"/>
+        <w:numPr>
+          <w:ilvl w:val="0"/>
+          <w:numId w:val="1"/>
+        </w:numPr>
+        <w:spacing w:after="55"/>
+        <w:ind w:left="360"/>
+      </w:pPr>
+      <w:r>
+        <w:rPr>
+          <w:rFonts w:ascii="Calibri" w:cs="Calibri" w:eastAsia="Calibri" w:hAnsi="Calibri"/>
+          <w:sz w:val="19"/>
+          <w:szCs w:val="19"/>
+        </w:rPr>
+        <w:t xml:space="preserve">Pulse - Music catalogue with a custom player that separates work, recording and release: full credits for each recording, band line-ups and search by a single line of lyrics. Python, FastAPI, PostgreSQL, React, Tailwind CSS, Docker.</w:t>
+      </w:r>
+    </w:p>
+    <w:p>
+      <w:pPr>
+        <w:pStyle w:val="ListParagraph"/>
+        <w:numPr>
+          <w:ilvl w:val="0"/>
+          <w:numId w:val="1"/>
+        </w:numPr>
+        <w:spacing w:after="55"/>
+        <w:ind w:left="360"/>
+      </w:pPr>
+      <w:r>
+        <w:rPr>
+          <w:rFonts w:ascii="Calibri" w:cs="Calibri" w:eastAsia="Calibri" w:hAnsi="Calibri"/>
+          <w:sz w:val="19"/>
+          <w:szCs w:val="19"/>
+        </w:rPr>
+        <w:t xml:space="preserve">Marvel World - Encyclopaedia of the Marvel universe with over 2,600 characters, directed relationships between them and a cross-navigable catalogue of powers, teams and locations, with idempotent importers from the Marvel API, TMDb and Wikidata. Python, FastAPI, PostgreSQL, React, Tailwind CSS, Docker.</w:t>
+      </w:r>
+    </w:p>
+    <w:p>
+      <w:pPr>
+        <w:pStyle w:val="ListParagraph"/>
+        <w:numPr>
+          <w:ilvl w:val="0"/>
+          <w:numId w:val="1"/>
+        </w:numPr>
+        <w:spacing w:after="55"/>
+        <w:ind w:left="360"/>
+      </w:pPr>
+      <w:r>
+        <w:rPr>
+          <w:rFonts w:ascii="Calibri" w:cs="Calibri" w:eastAsia="Calibri" w:hAnsi="Calibri"/>
+          <w:sz w:val="19"/>
+          <w:szCs w:val="19"/>
+        </w:rPr>
+        <w:t xml:space="preserve">Atelier - Management system for a clothing shop, centralising sales, purchases, inventory and garment rentals. Java, Spring Boot, PostgreSQL, React, Bootstrap.</w:t>
+      </w:r>
+    </w:p>
+    <w:p>
+      <w:pPr>
+        <w:pStyle w:val="ListParagraph"/>
+        <w:numPr>
+          <w:ilvl w:val="0"/>
+          <w:numId w:val="1"/>
+        </w:numPr>
+        <w:spacing w:after="55"/>
+        <w:ind w:left="360"/>
+      </w:pPr>
+      <w:r>
+        <w:rPr>
+          <w:rFonts w:ascii="Calibri" w:cs="Calibri" w:eastAsia="Calibri" w:hAnsi="Calibri"/>
+          <w:sz w:val="19"/>
+          <w:szCs w:val="19"/>
+        </w:rPr>
+        <w:t xml:space="preserve">Shop Easy - Mobile app for shopping lists with real-time synchronisation. Ionic, Angular, TypeScript, Firebase.</w:t>
       </w:r>
     </w:p>
     <w:p>

</xml_diff>

<commit_message>
feat(proyectos): Timon pasa a llamarse MotorV8 y los titulos van sin apellido
El sistema de taller se rebautizo como MotorV8 en su propio repositorio, y su
logo y su cabecera ya lo decian; el portfolio seguia con Timon en titulo,
descripcion, experiencia y CV. Se renombra en ambos idiomas, el identificador
de la tarjeta pasa a motorv8 y los archivos de imagen se llaman como el
proyecto.

Los titulos de Faro y MotorV8 quedan solo con el nombre: el resumen de debajo
ya dice "Nominas, asistencia..." y "Gestion para talleres mecanicos", asi que
el "· RRHH" y el "· Taller" repetian lo mismo.

Los .docx publicos se regeneran con el nombre nuevo.

Co-Authored-By: Claude Fable 5.1 <noreply@anthropic.com>
Claude-Session: https://claude.ai/code/session_01MK1ic2hkmdMewvy35xQTfJ
</commit_message>
<xml_diff>
--- a/public/cv/Pablo-Ocampos-CV-EN.docx
+++ b/public/cv/Pablo-Ocampos-CV-EN.docx
@@ -363,7 +363,7 @@
           <w:sz w:val="19"/>
           <w:szCs w:val="19"/>
         </w:rPr>
-        <w:t xml:space="preserve">Built Timon, a management system for car repair shops covering work orders, spare-part inventory with automatic stock deduction, cash register and public QR tracking, reusing Faro's multi-tenant core as a product template.</w:t>
+        <w:t xml:space="preserve">Built MotorV8, a management system for car repair shops covering work orders, spare-part inventory with automatic stock deduction, cash register and public QR tracking, reusing Faro's multi-tenant core as a product template.</w:t>
       </w:r>
     </w:p>
     <w:p>
@@ -1038,7 +1038,7 @@
           <w:sz w:val="19"/>
           <w:szCs w:val="19"/>
         </w:rPr>
-        <w:t xml:space="preserve">Timon (2026) - Management system for car repair shops: work orders with an eight-stage pipeline, spare-part inventory with automatic stock deduction, daily cash register and public QR tracking. Built on Faro's multi-tenant core. Python, FastAPI, PostgreSQL, React, Tailwind CSS, Docker.</w:t>
+        <w:t xml:space="preserve">MotorV8 (2026) - Management system for car repair shops: work orders with an eight-stage pipeline, spare-part inventory with automatic stock deduction, daily cash register and public QR tracking. Built on Faro's multi-tenant core. Python, FastAPI, PostgreSQL, React, Tailwind CSS, Docker.</w:t>
       </w:r>
     </w:p>
     <w:p>

</xml_diff>